<commit_message>
Materialy nejsou jen pro 1. rocnik: hlavicky a uvody bez rocniku
Hlavicky, plany hodin, metodiky, laboratore a Zacni zde uvadeji
stredni skolu; pole Rocnik v planech = kterykoli rocnik SS podle SVP.
Sbirka uloh: pokrocile sesity bez odkazu na prvni rocnik.

Co-Authored-By: Claude Opus 5.5 <noreply@anthropic.com>
</commit_message>
<xml_diff>
--- a/public/materialy/1L/2/_ucitel/1. Operační systém - plán hodiny.docx
+++ b/public/materialy/1L/2/_ucitel/1. Operační systém - plán hodiny.docx
@@ -32,7 +32,7 @@
           <w:sz w:val="26"/>
           <w:szCs w:val="26"/>
         </w:rPr>
-        <w:t>Úvod do informatiky a digitální gramotnost • 1. ročník SPŠ • 45 minut</w:t>
+        <w:t>Úvod do informatiky a digitální gramotnost • střední škola • 45 minut</w:t>
       </w:r>
     </w:p>
     <w:p>
@@ -265,7 +265,7 @@
                 <w:sz w:val="21"/>
                 <w:szCs w:val="21"/>
               </w:rPr>
-              <w:t>1. ročník, střední průmyslová škola (strojní a stavební obory)</w:t>
+              <w:t>kterýkoli ročník SŠ podle ŠVP (vzniklo pro strojní a stavební obory SPŠ)</w:t>
             </w:r>
           </w:p>
         </w:tc>

</xml_diff>